<commit_message>
Update POC-13 test case to use max-not-sum DR floor formula
- Prerequisites: replaced 'DR_RATIO_MAX known' with 'source portions known'
- Step 2: replaced fixed-ratio formula (Potential_DR_Demand × vCPU × DR_Ratio_Max)
  with max-not-sum (Destination_DR_Requirement = MAX(source portions) × vCPU)
- Added worked example (Source A=32, Source B=24 → MAX=32)
- Noted the retired fixed-ratio formula for historical reference
- Aligns POC test procedure with the DR sizing model changes (commit 11e17bd)
</commit_message>
<xml_diff>
--- a/POC-Test-Scripts/acrme_poc_workbook_v2_4.docx
+++ b/POC-Test-Scripts/acrme_poc_workbook_v2_4.docx
@@ -15764,7 +15764,7 @@
               <w:jc w:val="left"/>
             </w:pPr>
             <w:r>
-              <w:t xml:space="preserve">POC-11 Pass; potential_dr_demand and DR_RATIO_MAX known for the scenario</w:t>
+              <w:t xml:space="preserve">POC-11 Pass; source workload portions failing over to the DR region known (for max-not-sum calculation, A.6/DR-017)</w:t>
             </w:r>
           </w:p>
         </w:tc>
@@ -15908,7 +15908,95 @@
         <w:t xml:space="preserve"> </w:t>
       </w:r>
       <w:r>
-        <w:t xml:space="preserve">Calculate DR_Floor_vCPU = Potential_DR_Demand × vCPU_Per_Instance × DR_Ratio_Max (default DR_Ratio_Max = 0.40)</w:t>
+        <w:t xml:space="preserve">Calculate DR_Floor_vCPU using max-not-sum (A.6/DR-017):</w:t>
+      </w:r>
+      <w:r>
+        <w:t xml:space="preserve"> </w:t>
+      </w:r>
+      <w:r>
+        <w:t xml:space="preserve">-</w:t>
+      </w:r>
+      <w:r>
+        <w:t xml:space="preserve"> </w:t>
+      </w:r>
+      <w:r>
+        <w:rPr>
+          <w:rStyle w:val="VerbatimChar"/>
+        </w:rPr>
+        <w:t xml:space="preserve">Destination_DR_Requirement(region) = MAX(source portions failing over to this region)</w:t>
+      </w:r>
+      <w:r>
+        <w:t xml:space="preserve"> </w:t>
+      </w:r>
+      <w:r>
+        <w:t xml:space="preserve">(NOT sum of all sources)</w:t>
+      </w:r>
+      <w:r>
+        <w:t xml:space="preserve"> </w:t>
+      </w:r>
+      <w:r>
+        <w:t xml:space="preserve">-</w:t>
+      </w:r>
+      <w:r>
+        <w:t xml:space="preserve"> </w:t>
+      </w:r>
+      <w:r>
+        <w:rPr>
+          <w:rStyle w:val="VerbatimChar"/>
+        </w:rPr>
+        <w:t xml:space="preserve">DR_Floor_vCPU = Destination_DR_Requirement × vCPU_Per_Instance</w:t>
+      </w:r>
+      <w:r>
+        <w:t xml:space="preserve"> </w:t>
+      </w:r>
+      <w:r>
+        <w:t xml:space="preserve">- Example: if Source A sends 32 VMs and Source B sends 24 VMs to this DR region,</w:t>
+      </w:r>
+      <w:r>
+        <w:t xml:space="preserve"> </w:t>
+      </w:r>
+      <w:r>
+        <w:rPr>
+          <w:rStyle w:val="VerbatimChar"/>
+        </w:rPr>
+        <w:t xml:space="preserve">Destination_DR_Requirement = MAX(32, 24) = 32 VMs</w:t>
+      </w:r>
+      <w:r>
+        <w:t xml:space="preserve"> </w:t>
+      </w:r>
+      <w:r>
+        <w:t xml:space="preserve">-</w:t>
+      </w:r>
+      <w:r>
+        <w:t xml:space="preserve"> </w:t>
+      </w:r>
+      <w:r>
+        <w:rPr>
+          <w:bCs/>
+          <w:b/>
+        </w:rPr>
+        <w:t xml:space="preserve">Retired:</w:t>
+      </w:r>
+      <w:r>
+        <w:t xml:space="preserve"> </w:t>
+      </w:r>
+      <w:r>
+        <w:t xml:space="preserve">the former</w:t>
+      </w:r>
+      <w:r>
+        <w:t xml:space="preserve"> </w:t>
+      </w:r>
+      <w:r>
+        <w:rPr>
+          <w:rStyle w:val="VerbatimChar"/>
+        </w:rPr>
+        <w:t xml:space="preserve">Potential_DR_Demand × vCPU × DR_Ratio_Max (0.40)</w:t>
+      </w:r>
+      <w:r>
+        <w:t xml:space="preserve"> </w:t>
+      </w:r>
+      <w:r>
+        <w:t xml:space="preserve">fixed-ratio formula is no longer used (see Calc Logic Reference Scenario 15 → 17)</w:t>
       </w:r>
     </w:p>
     <w:p>

</xml_diff>